<commit_message>
Programmation de l'usage des fichiers JSON dans le projet, modifications pour l'interface d'usage. Il reste des petits détails à compléter ou arranger.
</commit_message>
<xml_diff>
--- a/APP4_gr1/énoncé_APP4.docx
+++ b/APP4_gr1/énoncé_APP4.docx
@@ -876,23 +876,7 @@
           <w:rFonts w:ascii="Calibri" w:hAnsi="Calibri" w:cs="Calibri"/>
           <w:highlight w:val="yellow"/>
         </w:rPr>
-        <w:t xml:space="preserve">Je n’exigerai pas de tests ou de </w:t>
-      </w:r>
-      <w:proofErr w:type="spellStart"/>
-      <w:r>
-        <w:rPr>
-          <w:rFonts w:ascii="Calibri" w:hAnsi="Calibri" w:cs="Calibri"/>
-          <w:highlight w:val="yellow"/>
-        </w:rPr>
-        <w:t>javadoc</w:t>
-      </w:r>
-      <w:proofErr w:type="spellEnd"/>
-      <w:r>
-        <w:rPr>
-          <w:rFonts w:ascii="Calibri" w:hAnsi="Calibri" w:cs="Calibri"/>
-          <w:highlight w:val="yellow"/>
-        </w:rPr>
-        <w:t xml:space="preserve"> pour ce travail,</w:t>
+        <w:t>Je n’exigerai pas de tests ou de javadoc pour ce travail,</w:t>
       </w:r>
       <w:r>
         <w:rPr>
@@ -1055,23 +1039,7 @@
         <w:jc w:val="both"/>
       </w:pPr>
       <w:r>
-        <w:t>Vous travaillez au sein du département de R&amp;D d'une firme spécialisée en infrastructures énergétiques intelligentes. L'entreprise conçoit des micro-réseaux (micro-</w:t>
-      </w:r>
-      <w:proofErr w:type="spellStart"/>
-      <w:r>
-        <w:t>grids</w:t>
-      </w:r>
-      <w:proofErr w:type="spellEnd"/>
-      <w:r>
-        <w:t>) capables de s'</w:t>
-      </w:r>
-      <w:proofErr w:type="spellStart"/>
-      <w:r>
-        <w:t>auto-organiser</w:t>
-      </w:r>
-      <w:proofErr w:type="spellEnd"/>
-      <w:r>
-        <w:t xml:space="preserve"> pour distribuer l'électricité de manière optimale entre des sources renouvelables et des clusters de consommation.</w:t>
+        <w:t>Vous travaillez au sein du département de R&amp;D d'une firme spécialisée en infrastructures énergétiques intelligentes. L'entreprise conçoit des micro-réseaux (micro-grids) capables de s'auto-organiser pour distribuer l'électricité de manière optimale entre des sources renouvelables et des clusters de consommation.</w:t>
       </w:r>
     </w:p>
     <w:p>
@@ -1157,15 +1125,7 @@
         <w:t xml:space="preserve"> </w:t>
       </w:r>
       <w:r>
-        <w:t xml:space="preserve">Cette structure "en poupées russes" rend impossible l'utilisation d'une boucle simple (for ou </w:t>
-      </w:r>
-      <w:proofErr w:type="spellStart"/>
-      <w:r>
-        <w:t>while</w:t>
-      </w:r>
-      <w:proofErr w:type="spellEnd"/>
-      <w:r>
-        <w:t>), car le nombre d'imbrications est inconnu au moment de la compilation.</w:t>
+        <w:t>Cette structure "en poupées russes" rend impossible l'utilisation d'une boucle simple (for ou while), car le nombre d'imbrications est inconnu au moment de la compilation.</w:t>
       </w:r>
       <w:r>
         <w:t xml:space="preserve"> </w:t>
@@ -1421,57 +1381,27 @@
         <w:rPr>
           <w:lang w:val="fr-CA"/>
         </w:rPr>
-        <w:t xml:space="preserve">fichiers </w:t>
-      </w:r>
-      <w:proofErr w:type="spellStart"/>
+        <w:t>fichiers json</w:t>
+      </w:r>
       <w:r>
         <w:rPr>
           <w:lang w:val="fr-CA"/>
         </w:rPr>
-        <w:t>json</w:t>
-      </w:r>
-      <w:proofErr w:type="spellEnd"/>
-      <w:r>
-        <w:rPr>
+        <w:t xml:space="preserve"> et lister les fichiers disponibles. Le technicien ne doit pas avoir à taper un nom complexe, mais simplement entrer un </w:t>
+      </w:r>
+      <w:r>
+        <w:rPr>
+          <w:b/>
+          <w:bCs/>
           <w:lang w:val="fr-CA"/>
         </w:rPr>
-        <w:t xml:space="preserve"> et lister les fichiers disponibles. Le technicien ne doit pas avoir à taper un nom complexe, mais simplement entrer un </w:t>
-      </w:r>
-      <w:r>
-        <w:rPr>
-          <w:b/>
-          <w:bCs/>
+        <w:t>numéro</w:t>
+      </w:r>
+      <w:r>
+        <w:rPr>
           <w:lang w:val="fr-CA"/>
         </w:rPr>
-        <w:t>numéro</w:t>
-      </w:r>
-      <w:r>
-        <w:rPr>
-          <w:lang w:val="fr-CA"/>
-        </w:rPr>
-        <w:t xml:space="preserve"> (ex: [1] </w:t>
-      </w:r>
-      <w:proofErr w:type="spellStart"/>
-      <w:r>
-        <w:rPr>
-          <w:lang w:val="fr-CA"/>
-        </w:rPr>
-        <w:t>circuit_</w:t>
-      </w:r>
-      <w:proofErr w:type="gramStart"/>
-      <w:r>
-        <w:rPr>
-          <w:lang w:val="fr-CA"/>
-        </w:rPr>
-        <w:t>nord.json</w:t>
-      </w:r>
-      <w:proofErr w:type="spellEnd"/>
-      <w:proofErr w:type="gramEnd"/>
-      <w:r>
-        <w:rPr>
-          <w:lang w:val="fr-CA"/>
-        </w:rPr>
-        <w:t>).</w:t>
+        <w:t xml:space="preserve"> (ex: [1] circuit_nord.json).</w:t>
       </w:r>
     </w:p>
     <w:p>
@@ -1706,21 +1636,7 @@
         <w:rPr>
           <w:lang w:val="fr-CA"/>
         </w:rPr>
-        <w:t xml:space="preserve"> (les </w:t>
-      </w:r>
-      <w:proofErr w:type="spellStart"/>
-      <w:r>
-        <w:rPr>
-          <w:lang w:val="fr-CA"/>
-        </w:rPr>
-        <w:t>System.out.println</w:t>
-      </w:r>
-      <w:proofErr w:type="spellEnd"/>
-      <w:r>
-        <w:rPr>
-          <w:lang w:val="fr-CA"/>
-        </w:rPr>
-        <w:t>).</w:t>
+        <w:t xml:space="preserve"> (les System.out.println).</w:t>
       </w:r>
     </w:p>
     <w:p>
@@ -2212,43 +2128,19 @@
         </w:drawing>
       </w:r>
       <w:r>
-        <w:t xml:space="preserve">Trois circuits vous sont fournis pour effectuer le travail. Ceux-ci ainsi que leur représentation </w:t>
-      </w:r>
-      <w:proofErr w:type="spellStart"/>
-      <w:r>
-        <w:t>json</w:t>
-      </w:r>
-      <w:proofErr w:type="spellEnd"/>
-      <w:r>
-        <w:t xml:space="preserve"> vous sont fournis dans le </w:t>
+        <w:t xml:space="preserve">Trois circuits vous sont fournis pour effectuer le travail. Ceux-ci ainsi que leur représentation json vous sont fournis dans le </w:t>
       </w:r>
       <w:r>
         <w:t>dossier</w:t>
       </w:r>
       <w:r>
-        <w:t xml:space="preserve"> « </w:t>
-      </w:r>
-      <w:proofErr w:type="spellStart"/>
-      <w:r>
-        <w:t>donnees</w:t>
-      </w:r>
-      <w:proofErr w:type="spellEnd"/>
-      <w:r>
-        <w:t> »</w:t>
+        <w:t xml:space="preserve"> « donnees »</w:t>
       </w:r>
       <w:r>
         <w:t xml:space="preserve"> fourni avec cet énoncé</w:t>
       </w:r>
       <w:r>
-        <w:t xml:space="preserve">. Prenez le temps de bien observer les circuits et la structure des </w:t>
-      </w:r>
-      <w:proofErr w:type="spellStart"/>
-      <w:r>
-        <w:t>json</w:t>
-      </w:r>
-      <w:proofErr w:type="spellEnd"/>
-      <w:r>
-        <w:t xml:space="preserve"> avant de commencer.</w:t>
+        <w:t>. Prenez le temps de bien observer les circuits et la structure des json avant de commencer.</w:t>
       </w:r>
     </w:p>
     <w:p>
@@ -3070,32 +2962,7 @@
           <w:rFonts w:ascii="Calibri" w:hAnsi="Calibri" w:cs="Calibri"/>
           <w:color w:val="000000"/>
         </w:rPr>
-        <w:t xml:space="preserve">On voit que la méthode </w:t>
-      </w:r>
-      <w:proofErr w:type="spellStart"/>
-      <w:proofErr w:type="gramStart"/>
-      <w:r>
-        <w:rPr>
-          <w:rFonts w:ascii="Calibri" w:hAnsi="Calibri" w:cs="Calibri"/>
-          <w:color w:val="000000"/>
-        </w:rPr>
-        <w:t>calculerResistance</w:t>
-      </w:r>
-      <w:proofErr w:type="spellEnd"/>
-      <w:r>
-        <w:rPr>
-          <w:rFonts w:ascii="Calibri" w:hAnsi="Calibri" w:cs="Calibri"/>
-          <w:color w:val="000000"/>
-        </w:rPr>
-        <w:t>(</w:t>
-      </w:r>
-      <w:proofErr w:type="gramEnd"/>
-      <w:r>
-        <w:rPr>
-          <w:rFonts w:ascii="Calibri" w:hAnsi="Calibri" w:cs="Calibri"/>
-          <w:color w:val="000000"/>
-        </w:rPr>
-        <w:t>) se répète dans plusieurs classes. Pourquoi ?</w:t>
+        <w:t>On voit que la méthode calculerResistance() se répète dans plusieurs classes. Pourquoi ?</w:t>
       </w:r>
     </w:p>
     <w:tbl>
@@ -4338,6 +4205,48 @@
           <w:szCs w:val="24"/>
         </w:rPr>
       </w:pPr>
+      <w:r>
+        <w:rPr>
+          <w:rFonts w:ascii="Calibri" w:hAnsi="Calibri" w:cs="Calibri"/>
+          <w:color w:val="000000"/>
+          <w:sz w:val="24"/>
+          <w:szCs w:val="24"/>
+        </w:rPr>
+        <w:t>https://github.com/FungChr/APP4-H26</w:t>
+      </w:r>
+    </w:p>
+    <w:p>
+      <w:pPr>
+        <w:pStyle w:val="PrformatHTML"/>
+        <w:pBdr>
+          <w:bottom w:val="single" w:sz="6" w:space="1" w:color="auto"/>
+        </w:pBdr>
+        <w:shd w:val="clear" w:color="auto" w:fill="FFFFFF"/>
+        <w:tabs>
+          <w:tab w:val="clear" w:pos="916"/>
+          <w:tab w:val="clear" w:pos="1832"/>
+          <w:tab w:val="clear" w:pos="2748"/>
+          <w:tab w:val="clear" w:pos="3664"/>
+          <w:tab w:val="clear" w:pos="4580"/>
+          <w:tab w:val="clear" w:pos="5496"/>
+          <w:tab w:val="clear" w:pos="6412"/>
+          <w:tab w:val="clear" w:pos="7328"/>
+          <w:tab w:val="clear" w:pos="8244"/>
+          <w:tab w:val="clear" w:pos="9160"/>
+          <w:tab w:val="clear" w:pos="10076"/>
+          <w:tab w:val="clear" w:pos="10992"/>
+          <w:tab w:val="clear" w:pos="11908"/>
+          <w:tab w:val="clear" w:pos="12824"/>
+          <w:tab w:val="clear" w:pos="13740"/>
+          <w:tab w:val="right" w:pos="11057"/>
+        </w:tabs>
+        <w:rPr>
+          <w:rFonts w:ascii="Calibri" w:hAnsi="Calibri" w:cs="Calibri"/>
+          <w:color w:val="000000"/>
+          <w:sz w:val="24"/>
+          <w:szCs w:val="24"/>
+        </w:rPr>
+      </w:pPr>
     </w:p>
     <w:p>
       <w:pPr>
@@ -4704,27 +4613,7 @@
           <w:sz w:val="24"/>
           <w:szCs w:val="24"/>
         </w:rPr>
-        <w:t xml:space="preserve">C’est le temps </w:t>
-      </w:r>
-      <w:proofErr w:type="gramStart"/>
-      <w:r>
-        <w:rPr>
-          <w:rFonts w:ascii="Calibri" w:hAnsi="Calibri" w:cs="Calibri"/>
-          <w:color w:val="000000"/>
-          <w:sz w:val="24"/>
-          <w:szCs w:val="24"/>
-        </w:rPr>
-        <w:t>de faire</w:t>
-      </w:r>
-      <w:proofErr w:type="gramEnd"/>
-      <w:r>
-        <w:rPr>
-          <w:rFonts w:ascii="Calibri" w:hAnsi="Calibri" w:cs="Calibri"/>
-          <w:color w:val="000000"/>
-          <w:sz w:val="24"/>
-          <w:szCs w:val="24"/>
-        </w:rPr>
-        <w:t xml:space="preserve"> vos recherches, consulter des ressources et </w:t>
+        <w:t xml:space="preserve">C’est le temps de faire vos recherches, consulter des ressources et </w:t>
       </w:r>
       <w:r>
         <w:rPr>
@@ -7275,18 +7164,8 @@
                 <w:sz w:val="18"/>
                 <w:szCs w:val="18"/>
               </w:rPr>
-              <w:t xml:space="preserve">Utilisation rigoureuse d’un gestionnaire de version          </w:t>
-            </w:r>
-            <w:proofErr w:type="gramStart"/>
-            <w:r>
-              <w:rPr>
-                <w:rFonts w:ascii="Calibri" w:hAnsi="Calibri" w:cs="Calibri"/>
-                <w:sz w:val="18"/>
-                <w:szCs w:val="18"/>
-              </w:rPr>
-              <w:t xml:space="preserve">   (</w:t>
-            </w:r>
-            <w:proofErr w:type="gramEnd"/>
+              <w:t>Utilisation rigoureuse d’un gestionnaire de version             (</w:t>
+            </w:r>
             <w:r>
               <w:rPr>
                 <w:rFonts w:ascii="Calibri" w:hAnsi="Calibri" w:cs="Calibri"/>
@@ -7542,25 +7421,7 @@
                 <w:sz w:val="18"/>
                 <w:szCs w:val="18"/>
               </w:rPr>
-              <w:t xml:space="preserve"> (</w:t>
-            </w:r>
-            <w:proofErr w:type="spellStart"/>
-            <w:r>
-              <w:rPr>
-                <w:rFonts w:ascii="Calibri" w:hAnsi="Calibri" w:cs="Calibri"/>
-                <w:sz w:val="18"/>
-                <w:szCs w:val="18"/>
-              </w:rPr>
-              <w:t>commits</w:t>
-            </w:r>
-            <w:proofErr w:type="spellEnd"/>
-            <w:r>
-              <w:rPr>
-                <w:rFonts w:ascii="Calibri" w:hAnsi="Calibri" w:cs="Calibri"/>
-                <w:sz w:val="18"/>
-                <w:szCs w:val="18"/>
-              </w:rPr>
-              <w:t xml:space="preserve"> présents, </w:t>
+              <w:t xml:space="preserve"> (commits présents, </w:t>
             </w:r>
             <w:r>
               <w:rPr>
@@ -7660,25 +7521,7 @@
                 <w:sz w:val="18"/>
                 <w:szCs w:val="18"/>
               </w:rPr>
-              <w:t>(</w:t>
-            </w:r>
-            <w:proofErr w:type="spellStart"/>
-            <w:r>
-              <w:rPr>
-                <w:rFonts w:ascii="Calibri" w:hAnsi="Calibri" w:cs="Calibri"/>
-                <w:sz w:val="18"/>
-                <w:szCs w:val="18"/>
-              </w:rPr>
-              <w:t>commits</w:t>
-            </w:r>
-            <w:proofErr w:type="spellEnd"/>
-            <w:r>
-              <w:rPr>
-                <w:rFonts w:ascii="Calibri" w:hAnsi="Calibri" w:cs="Calibri"/>
-                <w:sz w:val="18"/>
-                <w:szCs w:val="18"/>
-              </w:rPr>
-              <w:t xml:space="preserve"> réguliers</w:t>
+              <w:t>(commits réguliers</w:t>
             </w:r>
             <w:r>
               <w:rPr>
@@ -7764,23 +7607,13 @@
               </w:rPr>
               <w:t>Utilisation maîtrisée et rigoureuse (</w:t>
             </w:r>
-            <w:proofErr w:type="spellStart"/>
-            <w:r>
-              <w:rPr>
-                <w:rFonts w:ascii="Calibri" w:hAnsi="Calibri" w:cs="Calibri"/>
-                <w:sz w:val="18"/>
-                <w:szCs w:val="18"/>
-              </w:rPr>
-              <w:t>commits</w:t>
-            </w:r>
-            <w:proofErr w:type="spellEnd"/>
-            <w:r>
-              <w:rPr>
-                <w:rFonts w:ascii="Calibri" w:hAnsi="Calibri" w:cs="Calibri"/>
-                <w:sz w:val="18"/>
-                <w:szCs w:val="18"/>
-              </w:rPr>
-              <w:t xml:space="preserve"> systématiques, </w:t>
+            <w:r>
+              <w:rPr>
+                <w:rFonts w:ascii="Calibri" w:hAnsi="Calibri" w:cs="Calibri"/>
+                <w:sz w:val="18"/>
+                <w:szCs w:val="18"/>
+              </w:rPr>
+              <w:t xml:space="preserve">commits systématiques, </w:t>
             </w:r>
             <w:r>
               <w:rPr>

</xml_diff>